<commit_message>
Runbook C2: intrinsics corregidas al 16:9 real (320x180 cy90; 640x360 cy180)
Verificado en GPUEDGE tras el fix de predicted_depth: 72/72 bins con
metros plausibles (pared/mueble a 1.86 m). El runbook asumia 4:3.

Co-Authored-By: Claude Fable 5 <noreply@anthropic.com>
</commit_message>
<xml_diff>
--- a/docs/G1_Campaign2_Deployment_Test_Protocol.docx
+++ b/docs/G1_Campaign2_Deployment_Test_Protocol.docx
@@ -189,7 +189,7 @@
           <w:sz w:val="17"/>
           <w:color w:val="1A1A1A"/>
         </w:rPr>
-        <w:t xml:space="preserve">  --fx 300 --fy 300 --cx 160 --cy 120 --cam-h 1.10 --cam-pitch -10</w:t>
+        <w:t xml:space="preserve">  --fx 300 --fy 300 --cx 160 --cy 90 --cam-h 1.10 --cam-pitch -10   # frames are 16:9 (320x180)!</w:t>
       </w:r>
     </w:p>
     <w:p>
@@ -435,21 +435,21 @@
           <w:sz w:val="17"/>
           <w:color w:val="1A1A1A"/>
         </w:rPr>
-        <w:t xml:space="preserve"># server side (replace the intrinsics):   --fx 600 --fy 600 --cx 320 --cy 240</w:t>
-      </w:r>
-    </w:p>
-    <w:p>
-      <w:pPr>
-        <w:spacing w:after="0"/>
-        <w:shd w:val="clear" w:fill="F4F4F0"/>
-      </w:pPr>
-      <w:r>
-        <w:rPr>
-          <w:rFonts w:ascii="Consolas" w:hAnsi="Consolas"/>
-          <w:sz w:val="17"/>
-          <w:color w:val="1A1A1A"/>
-        </w:rPr>
-        <w:t xml:space="preserve"># RULE: capture width and intrinsics must always match (320-&gt; fx300 cx160 cy120; 640-&gt; fx600 cx320 cy240).</w:t>
+        <w:t xml:space="preserve"># server side (replace the intrinsics):   --fx 600 --fy 600 --cx 320 --cy 180</w:t>
+      </w:r>
+    </w:p>
+    <w:p>
+      <w:pPr>
+        <w:spacing w:after="0"/>
+        <w:shd w:val="clear" w:fill="F4F4F0"/>
+      </w:pPr>
+      <w:r>
+        <w:rPr>
+          <w:rFonts w:ascii="Consolas" w:hAnsi="Consolas"/>
+          <w:sz w:val="17"/>
+          <w:color w:val="1A1A1A"/>
+        </w:rPr>
+        <w:t xml:space="preserve"># RULE: capture width and intrinsics must always match (320x180-&gt; fx300 cx160 cy90; 640x360-&gt; fx600 cx320 cy180).</w:t>
       </w:r>
     </w:p>
     <w:p>

</xml_diff>